<commit_message>
Expand session scripts 2-8 with more dialogue, situations and tips
Co-Authored-By: Claude Opus 5.5 <noreply@anthropic.com>
Claude-Session: https://claude.ai/code/session_01Dxy8ARyCedZu8Drs7LqJx7
</commit_message>
<xml_diff>
--- a/sessions/Session_2_Second_Brain.docx
+++ b/sessions/Session_2_Second_Brain.docx
@@ -2638,6 +2638,114 @@
         <w:keepNext w:val="false"/>
         <w:keepLines/>
         <w:pBdr>
+          <w:right w:val="single" w:color="9B2C2C" w:sz="18" w:space="8"/>
+        </w:pBdr>
+        <w:shd w:fill="FBEAEA" w:color="auto" w:val="clear"/>
+        <w:bidi/>
+        <w:spacing w:after="140" w:before="0" w:line="300"/>
+      </w:pPr>
+      <w:r>
+        <w:rPr>
+          <w:rFonts w:ascii="Arial" w:cs="Arial" w:eastAsia="Arial" w:hAnsi="Arial"/>
+          <w:b/>
+          <w:bCs/>
+          <w:i w:val="false"/>
+          <w:color w:val="9B2C2C"/>
+          <w:sz w:val="22"/>
+          <w:szCs w:val="22"/>
+          <w:rtl/>
+        </w:rPr>
+        <w:t xml:space="preserve">لو حصل:  </w:t>
+      </w:r>
+      <w:r>
+        <w:rPr>
+          <w:rFonts w:ascii="Arial" w:cs="Arial" w:eastAsia="Arial" w:hAnsi="Arial"/>
+          <w:b w:val="false"/>
+          <w:i w:val="false"/>
+          <w:sz w:val="23"/>
+          <w:szCs w:val="23"/>
+          <w:rtl/>
+        </w:rPr>
+        <w:t xml:space="preserve">لو إيدين قليلة (٢ أو ٣ بس): ماتبانش زعلان. قول: «تمام، دول الأبطال. والباقي، إيه اللي منعكم؟ الوقت؟ ولا مالقيتوش حاجة تجربوها فيها؟». اسمع إجابتين، وقول: «النهارده هنحل ده. في آخر الجلسة هيبقى عندكم حاجة تستخدموها بكرة الصبح من غير ما تفكروا».</w:t>
+      </w:r>
+    </w:p>
+    <w:p>
+      <w:pPr>
+        <w:keepNext w:val="false"/>
+        <w:keepLines/>
+        <w:pBdr>
+          <w:right w:val="single" w:color="0E4F4B" w:sz="18" w:space="8"/>
+        </w:pBdr>
+        <w:shd w:fill="FFFFFF" w:color="auto" w:val="clear"/>
+        <w:bidi/>
+        <w:spacing w:after="140" w:before="0" w:line="300"/>
+      </w:pPr>
+      <w:r>
+        <w:rPr>
+          <w:rFonts w:ascii="Arial" w:cs="Arial" w:eastAsia="Arial" w:hAnsi="Arial"/>
+          <w:b/>
+          <w:bCs/>
+          <w:i w:val="false"/>
+          <w:color w:val="0E4F4B"/>
+          <w:sz w:val="22"/>
+          <w:szCs w:val="22"/>
+          <w:rtl/>
+        </w:rPr>
+        <w:t xml:space="preserve">تقول:  </w:t>
+      </w:r>
+      <w:r>
+        <w:rPr>
+          <w:rFonts w:ascii="Arial" w:cs="Arial" w:eastAsia="Arial" w:hAnsi="Arial"/>
+          <w:b w:val="false"/>
+          <w:i w:val="false"/>
+          <w:sz w:val="23"/>
+          <w:szCs w:val="23"/>
+          <w:rtl/>
+        </w:rPr>
+        <w:t xml:space="preserve">اللي جرّب، عايز أسمع منه حاجة واحدة: الأداة سألتك أسئلة كانت فاجئتك؟ يعني سألت عن حاجة إنت ماكنتش واخد بالك إنها مهمة؟</w:t>
+      </w:r>
+    </w:p>
+    <w:p>
+      <w:pPr>
+        <w:keepNext w:val="false"/>
+        <w:keepLines/>
+        <w:pBdr>
+          <w:right w:val="single" w:color="555555" w:sz="18" w:space="8"/>
+        </w:pBdr>
+        <w:shd w:fill="EEF2F1" w:color="auto" w:val="clear"/>
+        <w:bidi/>
+        <w:spacing w:after="140" w:before="0" w:line="300"/>
+      </w:pPr>
+      <w:r>
+        <w:rPr>
+          <w:rFonts w:ascii="Arial" w:cs="Arial" w:eastAsia="Arial" w:hAnsi="Arial"/>
+          <w:b/>
+          <w:bCs/>
+          <w:i w:val="false"/>
+          <w:color w:val="555555"/>
+          <w:sz w:val="22"/>
+          <w:szCs w:val="22"/>
+          <w:rtl/>
+        </w:rPr>
+        <w:t xml:space="preserve">على الشاشة / اعمل:  </w:t>
+      </w:r>
+      <w:r>
+        <w:rPr>
+          <w:rFonts w:ascii="Arial" w:cs="Arial" w:eastAsia="Arial" w:hAnsi="Arial"/>
+          <w:b w:val="false"/>
+          <w:i w:val="false"/>
+          <w:sz w:val="23"/>
+          <w:szCs w:val="23"/>
+          <w:rtl/>
+        </w:rPr>
+        <w:t xml:space="preserve">لو حد قال أيوه، اطلب منه يقرا السؤال اللي الأداة سألته. ده دليل حي إن الجملة الذهبية بتشتغل.</w:t>
+      </w:r>
+    </w:p>
+    <w:p>
+      <w:pPr>
+        <w:keepNext w:val="false"/>
+        <w:keepLines/>
+        <w:pBdr>
           <w:right w:val="single" w:color="0E4F4B" w:sz="18" w:space="8"/>
         </w:pBdr>
         <w:shd w:fill="FFFFFF" w:color="auto" w:val="clear"/>
@@ -3018,6 +3126,42 @@
     </w:p>
     <w:p>
       <w:pPr>
+        <w:keepNext w:val="false"/>
+        <w:keepLines/>
+        <w:pBdr>
+          <w:right w:val="single" w:color="0E4F4B" w:sz="18" w:space="8"/>
+        </w:pBdr>
+        <w:shd w:fill="FFFFFF" w:color="auto" w:val="clear"/>
+        <w:bidi/>
+        <w:spacing w:after="140" w:before="0" w:line="300"/>
+      </w:pPr>
+      <w:r>
+        <w:rPr>
+          <w:rFonts w:ascii="Arial" w:cs="Arial" w:eastAsia="Arial" w:hAnsi="Arial"/>
+          <w:b/>
+          <w:bCs/>
+          <w:i w:val="false"/>
+          <w:color w:val="0E4F4B"/>
+          <w:sz w:val="22"/>
+          <w:szCs w:val="22"/>
+          <w:rtl/>
+        </w:rPr>
+        <w:t xml:space="preserve">تقول:  </w:t>
+      </w:r>
+      <w:r>
+        <w:rPr>
+          <w:rFonts w:ascii="Arial" w:cs="Arial" w:eastAsia="Arial" w:hAnsi="Arial"/>
+          <w:b w:val="false"/>
+          <w:i w:val="false"/>
+          <w:sz w:val="23"/>
+          <w:szCs w:val="23"/>
+          <w:rtl/>
+        </w:rPr>
+        <w:t xml:space="preserve">وبالمناسبة، مكتبة البرومبتات فيها لحد دلوقتي [العدد] طلب. كل طلب هناك، حد تاني في قسم تاني ممكن ياخده ويستخدمه من غير ما يتعب. ده معنى إن المعرفة تبقى مشتركة، ودي فكرة النهارده بالظبط.</w:t>
+      </w:r>
+    </w:p>
+    <w:p>
+      <w:pPr>
         <w:bidi/>
         <w:spacing w:after="100" w:before="0" w:line="300"/>
       </w:pPr>
@@ -3149,6 +3293,114 @@
           <w:szCs w:val="23"/>
           <w:rtl/>
         </w:rPr>
+        <w:t xml:space="preserve">لو محدش اتطوع في ٥ ثواني، اختار حد باسمه بابتسامة: «أستاذة منى، شكلك سريعة. تعالي».</w:t>
+      </w:r>
+    </w:p>
+    <w:p>
+      <w:pPr>
+        <w:keepNext w:val="false"/>
+        <w:keepLines/>
+        <w:pBdr>
+          <w:right w:val="single" w:color="0E4F4B" w:sz="18" w:space="8"/>
+        </w:pBdr>
+        <w:shd w:fill="FFFFFF" w:color="auto" w:val="clear"/>
+        <w:bidi/>
+        <w:spacing w:after="140" w:before="0" w:line="300"/>
+      </w:pPr>
+      <w:r>
+        <w:rPr>
+          <w:rFonts w:ascii="Arial" w:cs="Arial" w:eastAsia="Arial" w:hAnsi="Arial"/>
+          <w:b/>
+          <w:bCs/>
+          <w:i w:val="false"/>
+          <w:color w:val="0E4F4B"/>
+          <w:sz w:val="22"/>
+          <w:szCs w:val="22"/>
+          <w:rtl/>
+        </w:rPr>
+        <w:t xml:space="preserve">تقول:  </w:t>
+      </w:r>
+      <w:r>
+        <w:rPr>
+          <w:rFonts w:ascii="Arial" w:cs="Arial" w:eastAsia="Arial" w:hAnsi="Arial"/>
+          <w:b w:val="false"/>
+          <w:i w:val="false"/>
+          <w:sz w:val="23"/>
+          <w:szCs w:val="23"/>
+          <w:rtl/>
+        </w:rPr>
+        <w:t xml:space="preserve">القواعد: هتقعدي هنا، والورق قدامك، وممنوع تسألي حد. أنا هقعد على اللابتوب. أول واحد يلاقي الإجابة يقول «لقيت». والقاعة هي الحكم.</w:t>
+      </w:r>
+    </w:p>
+    <w:p>
+      <w:pPr>
+        <w:keepNext w:val="false"/>
+        <w:keepLines/>
+        <w:pBdr>
+          <w:right w:val="single" w:color="9A5B12" w:sz="18" w:space="8"/>
+        </w:pBdr>
+        <w:shd w:fill="FBF3E4" w:color="auto" w:val="clear"/>
+        <w:bidi/>
+        <w:spacing w:after="140" w:before="0" w:line="300"/>
+      </w:pPr>
+      <w:r>
+        <w:rPr>
+          <w:rFonts w:ascii="Arial" w:cs="Arial" w:eastAsia="Arial" w:hAnsi="Arial"/>
+          <w:b/>
+          <w:bCs/>
+          <w:i w:val="false"/>
+          <w:color w:val="9A5B12"/>
+          <w:sz w:val="22"/>
+          <w:szCs w:val="22"/>
+          <w:rtl/>
+        </w:rPr>
+        <w:t xml:space="preserve">حيلة ذكية (إعلان القواعد):  </w:t>
+      </w:r>
+      <w:r>
+        <w:rPr>
+          <w:rFonts w:ascii="Arial" w:cs="Arial" w:eastAsia="Arial" w:hAnsi="Arial"/>
+          <w:b w:val="false"/>
+          <w:i w:val="false"/>
+          <w:sz w:val="23"/>
+          <w:szCs w:val="23"/>
+          <w:rtl/>
+        </w:rPr>
+        <w:t xml:space="preserve">لما تعلن قواعد اللعبة بوضوح وجدية، القاعة كلها بتتعامل معاها كمسابقة حقيقية وبتتحمس، حتى لو هي لعبة بسيطة.</w:t>
+      </w:r>
+    </w:p>
+    <w:p>
+      <w:pPr>
+        <w:keepNext w:val="false"/>
+        <w:keepLines/>
+        <w:pBdr>
+          <w:right w:val="single" w:color="555555" w:sz="18" w:space="8"/>
+        </w:pBdr>
+        <w:shd w:fill="EEF2F1" w:color="auto" w:val="clear"/>
+        <w:bidi/>
+        <w:spacing w:after="140" w:before="0" w:line="300"/>
+      </w:pPr>
+      <w:r>
+        <w:rPr>
+          <w:rFonts w:ascii="Arial" w:cs="Arial" w:eastAsia="Arial" w:hAnsi="Arial"/>
+          <w:b/>
+          <w:bCs/>
+          <w:i w:val="false"/>
+          <w:color w:val="555555"/>
+          <w:sz w:val="22"/>
+          <w:szCs w:val="22"/>
+          <w:rtl/>
+        </w:rPr>
+        <w:t xml:space="preserve">على الشاشة / اعمل:  </w:t>
+      </w:r>
+      <w:r>
+        <w:rPr>
+          <w:rFonts w:ascii="Arial" w:cs="Arial" w:eastAsia="Arial" w:hAnsi="Arial"/>
+          <w:b w:val="false"/>
+          <w:i w:val="false"/>
+          <w:sz w:val="23"/>
+          <w:szCs w:val="23"/>
+          <w:rtl/>
+        </w:rPr>
         <w:t xml:space="preserve">ادّي المتطوع الـ ٥ ملفات المطبوعة. وقول للقاعة إنه هيتسابق معاك.</w:t>
       </w:r>
     </w:p>
@@ -3295,6 +3547,78 @@
           <w:rtl/>
         </w:rPr>
         <w:t xml:space="preserve">لو المتطوع لقى الإجابة، اسأله لقاها فين. غالبًا هيقول ٥٠٠ من سياسة السفر.</w:t>
+      </w:r>
+    </w:p>
+    <w:p>
+      <w:pPr>
+        <w:keepNext w:val="false"/>
+        <w:keepLines/>
+        <w:pBdr>
+          <w:right w:val="single" w:color="9B2C2C" w:sz="18" w:space="8"/>
+        </w:pBdr>
+        <w:shd w:fill="FBEAEA" w:color="auto" w:val="clear"/>
+        <w:bidi/>
+        <w:spacing w:after="140" w:before="0" w:line="300"/>
+      </w:pPr>
+      <w:r>
+        <w:rPr>
+          <w:rFonts w:ascii="Arial" w:cs="Arial" w:eastAsia="Arial" w:hAnsi="Arial"/>
+          <w:b/>
+          <w:bCs/>
+          <w:i w:val="false"/>
+          <w:color w:val="9B2C2C"/>
+          <w:sz w:val="22"/>
+          <w:szCs w:val="22"/>
+          <w:rtl/>
+        </w:rPr>
+        <w:t xml:space="preserve">لو حصل:  </w:t>
+      </w:r>
+      <w:r>
+        <w:rPr>
+          <w:rFonts w:ascii="Arial" w:cs="Arial" w:eastAsia="Arial" w:hAnsi="Arial"/>
+          <w:b w:val="false"/>
+          <w:i w:val="false"/>
+          <w:sz w:val="23"/>
+          <w:szCs w:val="23"/>
+          <w:rtl/>
+        </w:rPr>
+        <w:t xml:space="preserve">لو المتطوع لقى الإجابة قبلك (ممكن يحصل لو قرا سياسة السفر الأول بالصدفة): احتفل بيه جدًا. وقول: «برافو! لقيتها في ٤٠ ثانية. بس خلّيني أسألك سؤال: متأكدة إن الرقم ده هو الرقم الوحيد في الملفات الخمسة؟». وكمّل للسؤال التاني. التناقض هيقلب الموقف لصالح الدفتر.</w:t>
+      </w:r>
+    </w:p>
+    <w:p>
+      <w:pPr>
+        <w:keepNext w:val="false"/>
+        <w:keepLines/>
+        <w:pBdr>
+          <w:right w:val="single" w:color="0E4F4B" w:sz="18" w:space="8"/>
+        </w:pBdr>
+        <w:shd w:fill="FFFFFF" w:color="auto" w:val="clear"/>
+        <w:bidi/>
+        <w:spacing w:after="140" w:before="0" w:line="300"/>
+      </w:pPr>
+      <w:r>
+        <w:rPr>
+          <w:rFonts w:ascii="Arial" w:cs="Arial" w:eastAsia="Arial" w:hAnsi="Arial"/>
+          <w:b/>
+          <w:bCs/>
+          <w:i w:val="false"/>
+          <w:color w:val="0E4F4B"/>
+          <w:sz w:val="22"/>
+          <w:szCs w:val="22"/>
+          <w:rtl/>
+        </w:rPr>
+        <w:t xml:space="preserve">تقول:  </w:t>
+      </w:r>
+      <w:r>
+        <w:rPr>
+          <w:rFonts w:ascii="Arial" w:cs="Arial" w:eastAsia="Arial" w:hAnsi="Arial"/>
+          <w:b w:val="false"/>
+          <w:i w:val="false"/>
+          <w:sz w:val="23"/>
+          <w:szCs w:val="23"/>
+          <w:rtl/>
+        </w:rPr>
+        <w:t xml:space="preserve">ممتاز. لاحظوا حاجة: الدفتر ماقالش ٥٠٠ وخلاص. قال ٥٠٠ ومعاها رقم صغير. الرقم ده لما بدوس عليه بيوديني للسطر الأصلي في الملف. يعني مش محتاج أصدّقه، أقدر أتأكد بنفسي في ثانية.</w:t>
       </w:r>
     </w:p>
     <w:p>
@@ -4061,6 +4385,78 @@
         <w:t xml:space="preserve">البناء خطوة بخطوة (على الشاشة، ببطء)</w:t>
       </w:r>
     </w:p>
+    <w:p>
+      <w:pPr>
+        <w:keepNext w:val="false"/>
+        <w:keepLines/>
+        <w:pBdr>
+          <w:right w:val="single" w:color="0E4F4B" w:sz="18" w:space="8"/>
+        </w:pBdr>
+        <w:shd w:fill="FFFFFF" w:color="auto" w:val="clear"/>
+        <w:bidi/>
+        <w:spacing w:after="140" w:before="0" w:line="300"/>
+      </w:pPr>
+      <w:r>
+        <w:rPr>
+          <w:rFonts w:ascii="Arial" w:cs="Arial" w:eastAsia="Arial" w:hAnsi="Arial"/>
+          <w:b/>
+          <w:bCs/>
+          <w:i w:val="false"/>
+          <w:color w:val="0E4F4B"/>
+          <w:sz w:val="22"/>
+          <w:szCs w:val="22"/>
+          <w:rtl/>
+        </w:rPr>
+        <w:t xml:space="preserve">تقول:  </w:t>
+      </w:r>
+      <w:r>
+        <w:rPr>
+          <w:rFonts w:ascii="Arial" w:cs="Arial" w:eastAsia="Arial" w:hAnsi="Arial"/>
+          <w:b w:val="false"/>
+          <w:i w:val="false"/>
+          <w:sz w:val="23"/>
+          <w:szCs w:val="23"/>
+          <w:rtl/>
+        </w:rPr>
+        <w:t xml:space="preserve">هعمل الخطوات دي قدامكم وأنا بتكلم، وإنتم ماتعملوش حاجة دلوقتي. بس ركّزوا. هتعملوها كلكم بعد نص ساعة.</w:t>
+      </w:r>
+    </w:p>
+    <w:p>
+      <w:pPr>
+        <w:keepNext w:val="false"/>
+        <w:keepLines/>
+        <w:pBdr>
+          <w:right w:val="single" w:color="555555" w:sz="18" w:space="8"/>
+        </w:pBdr>
+        <w:shd w:fill="EEF2F1" w:color="auto" w:val="clear"/>
+        <w:bidi/>
+        <w:spacing w:after="140" w:before="0" w:line="300"/>
+      </w:pPr>
+      <w:r>
+        <w:rPr>
+          <w:rFonts w:ascii="Arial" w:cs="Arial" w:eastAsia="Arial" w:hAnsi="Arial"/>
+          <w:b/>
+          <w:bCs/>
+          <w:i w:val="false"/>
+          <w:color w:val="555555"/>
+          <w:sz w:val="22"/>
+          <w:szCs w:val="22"/>
+          <w:rtl/>
+        </w:rPr>
+        <w:t xml:space="preserve">على الشاشة / اعمل:  </w:t>
+      </w:r>
+      <w:r>
+        <w:rPr>
+          <w:rFonts w:ascii="Arial" w:cs="Arial" w:eastAsia="Arial" w:hAnsi="Arial"/>
+          <w:b w:val="false"/>
+          <w:i w:val="false"/>
+          <w:sz w:val="23"/>
+          <w:szCs w:val="23"/>
+          <w:rtl/>
+        </w:rPr>
+        <w:t xml:space="preserve">وإنت بترفع الملفات، اتكلم بصوت عالي عن كل خطوة: «دلوقتي دوست على إضافة مصادر… اخترت الملفات الخمسة… شايفين؟ بيقراهم… بياخد ثواني».</w:t>
+      </w:r>
+    </w:p>
     <w:tbl>
       <w:tblPr>
         <w:bidiVisual/>
@@ -4675,6 +5071,151 @@
     </w:p>
     <w:p>
       <w:pPr>
+        <w:keepNext w:val="false"/>
+        <w:keepLines/>
+        <w:pBdr>
+          <w:right w:val="single" w:color="1D3A6B" w:sz="18" w:space="8"/>
+        </w:pBdr>
+        <w:shd w:fill="EEF1F8" w:color="auto" w:val="clear"/>
+        <w:bidi/>
+        <w:spacing w:after="140" w:before="0" w:line="300"/>
+      </w:pPr>
+      <w:r>
+        <w:rPr>
+          <w:rFonts w:ascii="Arial" w:cs="Arial" w:eastAsia="Arial" w:hAnsi="Arial"/>
+          <w:b/>
+          <w:bCs/>
+          <w:i w:val="false"/>
+          <w:color w:val="1D3A6B"/>
+          <w:sz w:val="22"/>
+          <w:szCs w:val="22"/>
+          <w:rtl/>
+        </w:rPr>
+        <w:t xml:space="preserve">اسأل القاعة:  </w:t>
+      </w:r>
+      <w:r>
+        <w:rPr>
+          <w:rFonts w:ascii="Arial" w:cs="Arial" w:eastAsia="Arial" w:hAnsi="Arial"/>
+          <w:b/>
+          <w:bCs/>
+          <w:i w:val="false"/>
+          <w:sz w:val="23"/>
+          <w:szCs w:val="23"/>
+          <w:rtl/>
+        </w:rPr>
+        <w:t xml:space="preserve">مين فيكم عنده فولدر على الجهاز فيه ملفات كتير، وكل مرة بيدوّر على حاجة بياخد وقت؟</w:t>
+      </w:r>
+    </w:p>
+    <w:p>
+      <w:pPr>
+        <w:keepNext w:val="false"/>
+        <w:keepLines/>
+        <w:pBdr>
+          <w:right w:val="single" w:color="1D3A6B" w:sz="18" w:space="8"/>
+        </w:pBdr>
+        <w:shd w:fill="EEF1F8" w:color="auto" w:val="clear"/>
+        <w:bidi/>
+        <w:spacing w:after="140" w:before="0" w:line="300"/>
+      </w:pPr>
+      <w:r>
+        <w:rPr>
+          <w:rFonts w:ascii="Arial" w:cs="Arial" w:eastAsia="Arial" w:hAnsi="Arial"/>
+          <w:b/>
+          <w:bCs/>
+          <w:i w:val="false"/>
+          <w:color w:val="1D3A6B"/>
+          <w:sz w:val="22"/>
+          <w:szCs w:val="22"/>
+          <w:rtl/>
+        </w:rPr>
+        <w:t xml:space="preserve">إجابات متوقعة:  </w:t>
+      </w:r>
+      <w:r>
+        <w:rPr>
+          <w:rFonts w:ascii="Arial" w:cs="Arial" w:eastAsia="Arial" w:hAnsi="Arial"/>
+          <w:b w:val="false"/>
+          <w:i w:val="false"/>
+          <w:sz w:val="23"/>
+          <w:szCs w:val="23"/>
+          <w:rtl/>
+        </w:rPr>
+        <w:t xml:space="preserve">الكل تقريبًا</w:t>
+      </w:r>
+    </w:p>
+    <w:p>
+      <w:pPr>
+        <w:keepNext w:val="false"/>
+        <w:keepLines/>
+        <w:pBdr>
+          <w:right w:val="single" w:color="0E4F4B" w:sz="18" w:space="8"/>
+        </w:pBdr>
+        <w:shd w:fill="FFFFFF" w:color="auto" w:val="clear"/>
+        <w:bidi/>
+        <w:spacing w:after="140" w:before="0" w:line="300"/>
+      </w:pPr>
+      <w:r>
+        <w:rPr>
+          <w:rFonts w:ascii="Arial" w:cs="Arial" w:eastAsia="Arial" w:hAnsi="Arial"/>
+          <w:b/>
+          <w:bCs/>
+          <w:i w:val="false"/>
+          <w:color w:val="0E4F4B"/>
+          <w:sz w:val="22"/>
+          <w:szCs w:val="22"/>
+          <w:rtl/>
+        </w:rPr>
+        <w:t xml:space="preserve">وبعدها تقول:  </w:t>
+      </w:r>
+      <w:r>
+        <w:rPr>
+          <w:rFonts w:ascii="Arial" w:cs="Arial" w:eastAsia="Arial" w:hAnsi="Arial"/>
+          <w:b w:val="false"/>
+          <w:i w:val="false"/>
+          <w:sz w:val="23"/>
+          <w:szCs w:val="23"/>
+          <w:rtl/>
+        </w:rPr>
+        <w:t xml:space="preserve">طب تخيلوا الفولدر ده بيتكلم. تسألوه «إيه المدة القانونية للمرتجعات؟» يرد عليكم في ثانية ويقولكم في أنهي ملف وأنهي سطر. ده اللي بنعمله.</w:t>
+      </w:r>
+    </w:p>
+    <w:p>
+      <w:pPr>
+        <w:keepNext w:val="false"/>
+        <w:keepLines/>
+        <w:pBdr>
+          <w:right w:val="single" w:color="9B2C2C" w:sz="18" w:space="8"/>
+        </w:pBdr>
+        <w:shd w:fill="FBEAEA" w:color="auto" w:val="clear"/>
+        <w:bidi/>
+        <w:spacing w:after="140" w:before="0" w:line="300"/>
+      </w:pPr>
+      <w:r>
+        <w:rPr>
+          <w:rFonts w:ascii="Arial" w:cs="Arial" w:eastAsia="Arial" w:hAnsi="Arial"/>
+          <w:b/>
+          <w:bCs/>
+          <w:i w:val="false"/>
+          <w:color w:val="9B2C2C"/>
+          <w:sz w:val="22"/>
+          <w:szCs w:val="22"/>
+          <w:rtl/>
+        </w:rPr>
+        <w:t xml:space="preserve">لو حصل:  </w:t>
+      </w:r>
+      <w:r>
+        <w:rPr>
+          <w:rFonts w:ascii="Arial" w:cs="Arial" w:eastAsia="Arial" w:hAnsi="Arial"/>
+          <w:b w:val="false"/>
+          <w:i w:val="false"/>
+          <w:sz w:val="23"/>
+          <w:szCs w:val="23"/>
+          <w:rtl/>
+        </w:rPr>
+        <w:t xml:space="preserve">لو الرفع بطيء أو الدفتر بياخد وقت يقرا الملفات: املا الوقت بسؤال للقاعة: «مين عارف بدل السفر عندكم في الشركة كام؟ ومنين عرفه؟». النقاش ده بيوصل لنفس الفكرة: المعلومة موجودة، بس مستخبية.</w:t>
+      </w:r>
+    </w:p>
+    <w:p>
+      <w:pPr>
         <w:pStyle w:val="Heading2"/>
         <w:keepNext/>
         <w:bidi/>
@@ -5032,6 +5573,152 @@
     </w:p>
     <w:p>
       <w:pPr>
+        <w:keepNext w:val="false"/>
+        <w:keepLines/>
+        <w:pBdr>
+          <w:right w:val="single" w:color="5B2A45" w:sz="18" w:space="8"/>
+        </w:pBdr>
+        <w:shd w:fill="F6EEF3" w:color="auto" w:val="clear"/>
+        <w:bidi/>
+        <w:spacing w:after="140" w:before="0" w:line="300"/>
+      </w:pPr>
+      <w:r>
+        <w:rPr>
+          <w:rFonts w:ascii="Arial" w:cs="Arial" w:eastAsia="Arial" w:hAnsi="Arial"/>
+          <w:b/>
+          <w:bCs/>
+          <w:i w:val="false"/>
+          <w:color w:val="5B2A45"/>
+          <w:sz w:val="22"/>
+          <w:szCs w:val="22"/>
+          <w:rtl/>
+        </w:rPr>
+        <w:t xml:space="preserve">لو اتسألت:  </w:t>
+      </w:r>
+      <w:r>
+        <w:rPr>
+          <w:rFonts w:ascii="Arial" w:cs="Arial" w:eastAsia="Arial" w:hAnsi="Arial"/>
+          <w:b/>
+          <w:bCs/>
+          <w:i w:val="false"/>
+          <w:sz w:val="23"/>
+          <w:szCs w:val="23"/>
+          <w:rtl/>
+        </w:rPr>
+        <w:t xml:space="preserve">بيفهم ملفات PDF بالعربي؟</w:t>
+      </w:r>
+    </w:p>
+    <w:p>
+      <w:pPr>
+        <w:keepNext w:val="false"/>
+        <w:keepLines/>
+        <w:pBdr>
+          <w:right w:val="single" w:color="5B2A45" w:sz="18" w:space="8"/>
+        </w:pBdr>
+        <w:shd w:fill="F6EEF3" w:color="auto" w:val="clear"/>
+        <w:bidi/>
+        <w:spacing w:after="140" w:before="0" w:line="300"/>
+      </w:pPr>
+      <w:r>
+        <w:rPr>
+          <w:rFonts w:ascii="Arial" w:cs="Arial" w:eastAsia="Arial" w:hAnsi="Arial"/>
+          <w:b/>
+          <w:bCs/>
+          <w:i w:val="false"/>
+          <w:color w:val="5B2A45"/>
+          <w:sz w:val="22"/>
+          <w:szCs w:val="22"/>
+          <w:rtl/>
+        </w:rPr>
+        <w:t xml:space="preserve">ترد:  </w:t>
+      </w:r>
+      <w:r>
+        <w:rPr>
+          <w:rFonts w:ascii="Arial" w:cs="Arial" w:eastAsia="Arial" w:hAnsi="Arial"/>
+          <w:b w:val="false"/>
+          <w:i w:val="false"/>
+          <w:sz w:val="23"/>
+          <w:szCs w:val="23"/>
+          <w:rtl/>
+        </w:rPr>
+        <w:t xml:space="preserve">أيوه، لو الـ PDF فيه نص حقيقي. لو الملف متصوّر بالسكانر (صورة)، ممكن مايقراهوش كويس. جرّب تنسخ كلمة من الملف: لو اتنسخت، يبقى نص.</w:t>
+      </w:r>
+    </w:p>
+    <w:p>
+      <w:pPr>
+        <w:keepNext w:val="false"/>
+        <w:keepLines/>
+        <w:pBdr>
+          <w:right w:val="single" w:color="5B2A45" w:sz="18" w:space="8"/>
+        </w:pBdr>
+        <w:shd w:fill="F6EEF3" w:color="auto" w:val="clear"/>
+        <w:bidi/>
+        <w:spacing w:after="140" w:before="0" w:line="300"/>
+      </w:pPr>
+      <w:r>
+        <w:rPr>
+          <w:rFonts w:ascii="Arial" w:cs="Arial" w:eastAsia="Arial" w:hAnsi="Arial"/>
+          <w:b/>
+          <w:bCs/>
+          <w:i w:val="false"/>
+          <w:color w:val="5B2A45"/>
+          <w:sz w:val="22"/>
+          <w:szCs w:val="22"/>
+          <w:rtl/>
+        </w:rPr>
+        <w:t xml:space="preserve">لو اتسألت:  </w:t>
+      </w:r>
+      <w:r>
+        <w:rPr>
+          <w:rFonts w:ascii="Arial" w:cs="Arial" w:eastAsia="Arial" w:hAnsi="Arial"/>
+          <w:b/>
+          <w:bCs/>
+          <w:i w:val="false"/>
+          <w:sz w:val="23"/>
+          <w:szCs w:val="23"/>
+          <w:rtl/>
+        </w:rPr>
+        <w:t xml:space="preserve">ينفع الملخص الصوتي يبقى بالعامية المصرية؟</w:t>
+      </w:r>
+    </w:p>
+    <w:p>
+      <w:pPr>
+        <w:keepNext w:val="false"/>
+        <w:keepLines/>
+        <w:pBdr>
+          <w:right w:val="single" w:color="5B2A45" w:sz="18" w:space="8"/>
+        </w:pBdr>
+        <w:shd w:fill="F6EEF3" w:color="auto" w:val="clear"/>
+        <w:bidi/>
+        <w:spacing w:after="140" w:before="0" w:line="300"/>
+      </w:pPr>
+      <w:r>
+        <w:rPr>
+          <w:rFonts w:ascii="Arial" w:cs="Arial" w:eastAsia="Arial" w:hAnsi="Arial"/>
+          <w:b/>
+          <w:bCs/>
+          <w:i w:val="false"/>
+          <w:color w:val="5B2A45"/>
+          <w:sz w:val="22"/>
+          <w:szCs w:val="22"/>
+          <w:rtl/>
+        </w:rPr>
+        <w:t xml:space="preserve">ترد:  </w:t>
+      </w:r>
+      <w:r>
+        <w:rPr>
+          <w:rFonts w:ascii="Arial" w:cs="Arial" w:eastAsia="Arial" w:hAnsi="Arial"/>
+          <w:b w:val="false"/>
+          <w:i w:val="false"/>
+          <w:sz w:val="23"/>
+          <w:szCs w:val="23"/>
+          <w:rtl/>
+        </w:rPr>
+        <w:t xml:space="preserve">الأداة بتختار الأسلوب بنفسها، وممكن تديها تعليمات في الإعدادات (زي «اشرح ببساطة لموظف جديد»). جرّب واسمع النتيجة.</w:t>
+      </w:r>
+    </w:p>
+    <w:p>
+      <w:pPr>
         <w:bidi/>
         <w:spacing w:after="100" w:before="0" w:line="300"/>
       </w:pPr>
@@ -5128,6 +5815,210 @@
           <w:rtl/>
         </w:rPr>
         <w:t xml:space="preserve">قبل ما حد يرفع أي ملف، لازم نتفق على قاعدة. أي ملف بترفعه على أداة برّه الشركة، اعتبر إنه ممكن حد تاني يشوفه يومًا ما.</w:t>
+      </w:r>
+    </w:p>
+    <w:p>
+      <w:pPr>
+        <w:keepNext w:val="false"/>
+        <w:keepLines/>
+        <w:pBdr>
+          <w:right w:val="single" w:color="0E4F4B" w:sz="18" w:space="8"/>
+        </w:pBdr>
+        <w:shd w:fill="FFFFFF" w:color="auto" w:val="clear"/>
+        <w:bidi/>
+        <w:spacing w:after="140" w:before="0" w:line="300"/>
+      </w:pPr>
+      <w:r>
+        <w:rPr>
+          <w:rFonts w:ascii="Arial" w:cs="Arial" w:eastAsia="Arial" w:hAnsi="Arial"/>
+          <w:b/>
+          <w:bCs/>
+          <w:i w:val="false"/>
+          <w:color w:val="0E4F4B"/>
+          <w:sz w:val="22"/>
+          <w:szCs w:val="22"/>
+          <w:rtl/>
+        </w:rPr>
+        <w:t xml:space="preserve">تقول:  </w:t>
+      </w:r>
+      <w:r>
+        <w:rPr>
+          <w:rFonts w:ascii="Arial" w:cs="Arial" w:eastAsia="Arial" w:hAnsi="Arial"/>
+          <w:b w:val="false"/>
+          <w:i w:val="false"/>
+          <w:sz w:val="23"/>
+          <w:szCs w:val="23"/>
+          <w:rtl/>
+        </w:rPr>
+        <w:t xml:space="preserve">خلّوني أحكيلكم حكاية شبه اللي بتحصل كتير في الشركات. موظف شاطر ومجتهد، كان عايز يخلّص تقرير بسرعة. رفع شيت فيه أسماء العملا وأرقامهم وأسعار العقود على أداة مجانية، عشان تعمله ملخص. التقرير طلع حلو جدًا. بس هو كده حط بيانات العملا على سيرفر شركة تانية، من غير ما حد في شركته يوافق.</w:t>
+      </w:r>
+    </w:p>
+    <w:p>
+      <w:pPr>
+        <w:keepNext w:val="false"/>
+        <w:keepLines/>
+        <w:pBdr>
+          <w:right w:val="single" w:color="1D3A6B" w:sz="18" w:space="8"/>
+        </w:pBdr>
+        <w:shd w:fill="EEF1F8" w:color="auto" w:val="clear"/>
+        <w:bidi/>
+        <w:spacing w:after="140" w:before="0" w:line="300"/>
+      </w:pPr>
+      <w:r>
+        <w:rPr>
+          <w:rFonts w:ascii="Arial" w:cs="Arial" w:eastAsia="Arial" w:hAnsi="Arial"/>
+          <w:b/>
+          <w:bCs/>
+          <w:i w:val="false"/>
+          <w:color w:val="1D3A6B"/>
+          <w:sz w:val="22"/>
+          <w:szCs w:val="22"/>
+          <w:rtl/>
+        </w:rPr>
+        <w:t xml:space="preserve">اسأل القاعة:  </w:t>
+      </w:r>
+      <w:r>
+        <w:rPr>
+          <w:rFonts w:ascii="Arial" w:cs="Arial" w:eastAsia="Arial" w:hAnsi="Arial"/>
+          <w:b/>
+          <w:bCs/>
+          <w:i w:val="false"/>
+          <w:sz w:val="23"/>
+          <w:szCs w:val="23"/>
+          <w:rtl/>
+        </w:rPr>
+        <w:t xml:space="preserve">هو كان قصده وحش؟</w:t>
+      </w:r>
+    </w:p>
+    <w:p>
+      <w:pPr>
+        <w:keepNext/>
+        <w:keepLines/>
+        <w:pBdr>
+          <w:right w:val="single" w:color="1D3A6B" w:sz="18" w:space="8"/>
+        </w:pBdr>
+        <w:shd w:fill="EEF1F8" w:color="auto" w:val="clear"/>
+        <w:bidi/>
+        <w:spacing w:after="0" w:before="0" w:line="300"/>
+      </w:pPr>
+      <w:r>
+        <w:rPr>
+          <w:rFonts w:ascii="Arial" w:cs="Arial" w:eastAsia="Arial" w:hAnsi="Arial"/>
+          <w:b/>
+          <w:bCs/>
+          <w:i w:val="false"/>
+          <w:color w:val="1D3A6B"/>
+          <w:sz w:val="22"/>
+          <w:szCs w:val="22"/>
+          <w:rtl/>
+        </w:rPr>
+        <w:t xml:space="preserve">إجابات متوقعة:  </w:t>
+      </w:r>
+      <w:r>
+        <w:rPr>
+          <w:rFonts w:ascii="Arial" w:cs="Arial" w:eastAsia="Arial" w:hAnsi="Arial"/>
+          <w:b w:val="false"/>
+          <w:i w:val="false"/>
+          <w:sz w:val="23"/>
+          <w:szCs w:val="23"/>
+          <w:rtl/>
+        </w:rPr>
+        <w:t xml:space="preserve">لأ</w:t>
+      </w:r>
+    </w:p>
+    <w:p>
+      <w:pPr>
+        <w:keepNext w:val="false"/>
+        <w:keepLines/>
+        <w:pBdr>
+          <w:right w:val="single" w:color="1D3A6B" w:sz="18" w:space="8"/>
+        </w:pBdr>
+        <w:shd w:fill="EEF1F8" w:color="auto" w:val="clear"/>
+        <w:bidi/>
+        <w:spacing w:after="140" w:before="0" w:line="300"/>
+      </w:pPr>
+      <w:r>
+        <w:rPr>
+          <w:rFonts w:ascii="Arial" w:cs="Arial" w:eastAsia="Arial" w:hAnsi="Arial"/>
+          <w:b w:val="false"/>
+          <w:i w:val="false"/>
+          <w:sz w:val="23"/>
+          <w:szCs w:val="23"/>
+          <w:rtl/>
+        </w:rPr>
+        <w:t xml:space="preserve">كان عايز يخلّص شغله</w:t>
+      </w:r>
+    </w:p>
+    <w:p>
+      <w:pPr>
+        <w:keepNext w:val="false"/>
+        <w:keepLines/>
+        <w:pBdr>
+          <w:right w:val="single" w:color="0E4F4B" w:sz="18" w:space="8"/>
+        </w:pBdr>
+        <w:shd w:fill="FFFFFF" w:color="auto" w:val="clear"/>
+        <w:bidi/>
+        <w:spacing w:after="140" w:before="0" w:line="300"/>
+      </w:pPr>
+      <w:r>
+        <w:rPr>
+          <w:rFonts w:ascii="Arial" w:cs="Arial" w:eastAsia="Arial" w:hAnsi="Arial"/>
+          <w:b/>
+          <w:bCs/>
+          <w:i w:val="false"/>
+          <w:color w:val="0E4F4B"/>
+          <w:sz w:val="22"/>
+          <w:szCs w:val="22"/>
+          <w:rtl/>
+        </w:rPr>
+        <w:t xml:space="preserve">وبعدها تقول:  </w:t>
+      </w:r>
+      <w:r>
+        <w:rPr>
+          <w:rFonts w:ascii="Arial" w:cs="Arial" w:eastAsia="Arial" w:hAnsi="Arial"/>
+          <w:b w:val="false"/>
+          <w:i w:val="false"/>
+          <w:sz w:val="23"/>
+          <w:szCs w:val="23"/>
+          <w:rtl/>
+        </w:rPr>
+        <w:t xml:space="preserve">بالظبط. ودي المشكلة. أغلب مشاكل السرية مش من ناس وحشة، من ناس شاطرة ومستعجلة. عشان كده محتاجين قاعدة بسيطة تتطبق في ثانية.</w:t>
+      </w:r>
+    </w:p>
+    <w:p>
+      <w:pPr>
+        <w:keepNext w:val="false"/>
+        <w:keepLines/>
+        <w:pBdr>
+          <w:right w:val="single" w:color="9A5B12" w:sz="18" w:space="8"/>
+        </w:pBdr>
+        <w:shd w:fill="FBF3E4" w:color="auto" w:val="clear"/>
+        <w:bidi/>
+        <w:spacing w:after="140" w:before="0" w:line="300"/>
+      </w:pPr>
+      <w:r>
+        <w:rPr>
+          <w:rFonts w:ascii="Arial" w:cs="Arial" w:eastAsia="Arial" w:hAnsi="Arial"/>
+          <w:b/>
+          <w:bCs/>
+          <w:i w:val="false"/>
+          <w:color w:val="9A5B12"/>
+          <w:sz w:val="22"/>
+          <w:szCs w:val="22"/>
+          <w:rtl/>
+        </w:rPr>
+        <w:t xml:space="preserve">حيلة ذكية (القصة قبل القاعدة):  </w:t>
+      </w:r>
+      <w:r>
+        <w:rPr>
+          <w:rFonts w:ascii="Arial" w:cs="Arial" w:eastAsia="Arial" w:hAnsi="Arial"/>
+          <w:b w:val="false"/>
+          <w:i w:val="false"/>
+          <w:sz w:val="23"/>
+          <w:szCs w:val="23"/>
+          <w:rtl/>
+        </w:rPr>
+        <w:t xml:space="preserve">القصة بتخلّي القاعدة ليها «وش». بدل «ماترفعش بيانات حساسة» اللي سمعوها ألف مرة، هيفتكروا «الموظف الشاطر المستعجل». ولاحظ إنك قلت «حكاية شبه اللي بتحصل»، مش حكاية حقيقية باسم شركة.</w:t>
       </w:r>
     </w:p>
     <w:tbl>
@@ -6454,6 +7345,42 @@
         <w:keepNext w:val="false"/>
         <w:keepLines/>
         <w:pBdr>
+          <w:right w:val="single" w:color="0E4F4B" w:sz="18" w:space="8"/>
+        </w:pBdr>
+        <w:shd w:fill="FFFFFF" w:color="auto" w:val="clear"/>
+        <w:bidi/>
+        <w:spacing w:after="140" w:before="0" w:line="300"/>
+      </w:pPr>
+      <w:r>
+        <w:rPr>
+          <w:rFonts w:ascii="Arial" w:cs="Arial" w:eastAsia="Arial" w:hAnsi="Arial"/>
+          <w:b/>
+          <w:bCs/>
+          <w:i w:val="false"/>
+          <w:color w:val="0E4F4B"/>
+          <w:sz w:val="22"/>
+          <w:szCs w:val="22"/>
+          <w:rtl/>
+        </w:rPr>
+        <w:t xml:space="preserve">تقول:  </w:t>
+      </w:r>
+      <w:r>
+        <w:rPr>
+          <w:rFonts w:ascii="Arial" w:cs="Arial" w:eastAsia="Arial" w:hAnsi="Arial"/>
+          <w:b w:val="false"/>
+          <w:i w:val="false"/>
+          <w:sz w:val="23"/>
+          <w:szCs w:val="23"/>
+          <w:rtl/>
+        </w:rPr>
+        <w:t xml:space="preserve">بعد ما خلّصنا: فيه عنصرين الناس بتختلف فيهم دايمًا: تقرير المبيعات بالإجماليات، وإيميل الشكوى. ودول بالظبط «الأصفر». الأصفر معناه: فكّر قبل ما ترفع. شيل الأسماء، غيّر الأرقام الحساسة، وبعدين ارفع.</w:t>
+      </w:r>
+    </w:p>
+    <w:p>
+      <w:pPr>
+        <w:keepNext w:val="false"/>
+        <w:keepLines/>
+        <w:pBdr>
           <w:right w:val="single" w:color="9A5B12" w:sz="18" w:space="8"/>
         </w:pBdr>
         <w:shd w:fill="FBF3E4" w:color="auto" w:val="clear"/>
@@ -6665,6 +7592,79 @@
           <w:rtl/>
         </w:rPr>
         <w:t xml:space="preserve">استبدل الأسماء بـ «عميل ١، عميل ٢»، والأرقام الحساسة بأرقام تقريبية أو نسب. وفي الجلسات الجاية هنتعلم نخلّي الأداة تعمل ده لوحدها على جهازك.</w:t>
+      </w:r>
+    </w:p>
+    <w:p>
+      <w:pPr>
+        <w:keepNext w:val="false"/>
+        <w:keepLines/>
+        <w:pBdr>
+          <w:right w:val="single" w:color="5B2A45" w:sz="18" w:space="8"/>
+        </w:pBdr>
+        <w:shd w:fill="F6EEF3" w:color="auto" w:val="clear"/>
+        <w:bidi/>
+        <w:spacing w:after="140" w:before="0" w:line="300"/>
+      </w:pPr>
+      <w:r>
+        <w:rPr>
+          <w:rFonts w:ascii="Arial" w:cs="Arial" w:eastAsia="Arial" w:hAnsi="Arial"/>
+          <w:b/>
+          <w:bCs/>
+          <w:i w:val="false"/>
+          <w:color w:val="5B2A45"/>
+          <w:sz w:val="22"/>
+          <w:szCs w:val="22"/>
+          <w:rtl/>
+        </w:rPr>
+        <w:t xml:space="preserve">لو اتسألت:  </w:t>
+      </w:r>
+      <w:r>
+        <w:rPr>
+          <w:rFonts w:ascii="Arial" w:cs="Arial" w:eastAsia="Arial" w:hAnsi="Arial"/>
+          <w:b/>
+          <w:bCs/>
+          <w:i w:val="false"/>
+          <w:sz w:val="23"/>
+          <w:szCs w:val="23"/>
+          <w:rtl/>
+        </w:rPr>
+        <w:t xml:space="preserve">ولو مديري طلب مني أرفع ملف أحمر؟</w:t>
+      </w:r>
+    </w:p>
+    <w:p>
+      <w:pPr>
+        <w:keepNext w:val="false"/>
+        <w:keepLines/>
+        <w:pBdr>
+          <w:right w:val="single" w:color="5B2A45" w:sz="18" w:space="8"/>
+        </w:pBdr>
+        <w:shd w:fill="F6EEF3" w:color="auto" w:val="clear"/>
+        <w:bidi/>
+        <w:spacing w:after="140" w:before="0" w:line="300"/>
+      </w:pPr>
+      <w:r>
+        <w:rPr>
+          <w:rFonts w:ascii="Arial" w:cs="Arial" w:eastAsia="Arial" w:hAnsi="Arial"/>
+          <w:b/>
+          <w:bCs/>
+          <w:i w:val="false"/>
+          <w:color w:val="5B2A45"/>
+          <w:sz w:val="22"/>
+          <w:szCs w:val="22"/>
+          <w:rtl/>
+        </w:rPr>
+        <w:t xml:space="preserve">ترد:  </w:t>
+      </w:r>
+      <w:r>
+        <w:rPr>
+          <w:rFonts w:ascii="Arial" w:cs="Arial" w:eastAsia="Arial" w:hAnsi="Arial"/>
+          <w:b w:val="false"/>
+          <w:i w:val="false"/>
+          <w:sz w:val="23"/>
+          <w:szCs w:val="23"/>
+          <w:rtl/>
+        </w:rPr>
+        <w:t xml:space="preserve">قول له بأدب إن الملف فيه بيانات حساسة، واقترح بديل: نسخة من غير الأسماء، أو أداة معتمدة من الشركة. ولو أصرّ، خلّي الطلب مكتوب، وارجع لسياسة الشركة أو قسم التقنية.</w:t>
       </w:r>
     </w:p>
     <w:p>
@@ -7931,6 +8931,197 @@
     </w:p>
     <w:p>
       <w:pPr>
+        <w:keepNext w:val="false"/>
+        <w:keepLines/>
+        <w:pBdr>
+          <w:right w:val="single" w:color="0E4F4B" w:sz="18" w:space="8"/>
+        </w:pBdr>
+        <w:shd w:fill="FFFFFF" w:color="auto" w:val="clear"/>
+        <w:bidi/>
+        <w:spacing w:after="140" w:before="0" w:line="300"/>
+      </w:pPr>
+      <w:r>
+        <w:rPr>
+          <w:rFonts w:ascii="Arial" w:cs="Arial" w:eastAsia="Arial" w:hAnsi="Arial"/>
+          <w:b/>
+          <w:bCs/>
+          <w:i w:val="false"/>
+          <w:color w:val="0E4F4B"/>
+          <w:sz w:val="22"/>
+          <w:szCs w:val="22"/>
+          <w:rtl/>
+        </w:rPr>
+        <w:t xml:space="preserve">تقول:  </w:t>
+      </w:r>
+      <w:r>
+        <w:rPr>
+          <w:rFonts w:ascii="Arial" w:cs="Arial" w:eastAsia="Arial" w:hAnsi="Arial"/>
+          <w:b w:val="false"/>
+          <w:i w:val="false"/>
+          <w:sz w:val="23"/>
+          <w:szCs w:val="23"/>
+          <w:rtl/>
+        </w:rPr>
+        <w:t xml:space="preserve">خلّوني أقف عند القاعدة الأولى. دفتر اسمه «ملفات الشغل» فيه ٤٠ ملف عن كل حاجة. لما تسأله عن الإجازات، ممكن يجاوبك من ملف المشتريات لأنه لقى كلمة «إجازة» هناك. الخلطة بتضعف الإجابة.</w:t>
+      </w:r>
+    </w:p>
+    <w:p>
+      <w:pPr>
+        <w:keepNext w:val="false"/>
+        <w:keepLines/>
+        <w:pBdr>
+          <w:right w:val="single" w:color="1D3A6B" w:sz="18" w:space="8"/>
+        </w:pBdr>
+        <w:shd w:fill="EEF1F8" w:color="auto" w:val="clear"/>
+        <w:bidi/>
+        <w:spacing w:after="140" w:before="0" w:line="300"/>
+      </w:pPr>
+      <w:r>
+        <w:rPr>
+          <w:rFonts w:ascii="Arial" w:cs="Arial" w:eastAsia="Arial" w:hAnsi="Arial"/>
+          <w:b/>
+          <w:bCs/>
+          <w:i w:val="false"/>
+          <w:color w:val="1D3A6B"/>
+          <w:sz w:val="22"/>
+          <w:szCs w:val="22"/>
+          <w:rtl/>
+        </w:rPr>
+        <w:t xml:space="preserve">اسأل القاعة:  </w:t>
+      </w:r>
+      <w:r>
+        <w:rPr>
+          <w:rFonts w:ascii="Arial" w:cs="Arial" w:eastAsia="Arial" w:hAnsi="Arial"/>
+          <w:b/>
+          <w:bCs/>
+          <w:i w:val="false"/>
+          <w:sz w:val="23"/>
+          <w:szCs w:val="23"/>
+          <w:rtl/>
+        </w:rPr>
+        <w:t xml:space="preserve">لو هتعمل ٣ دفاتر لقسمك، هتسميهم إيه؟</w:t>
+      </w:r>
+    </w:p>
+    <w:p>
+      <w:pPr>
+        <w:keepNext/>
+        <w:keepLines/>
+        <w:pBdr>
+          <w:right w:val="single" w:color="1D3A6B" w:sz="18" w:space="8"/>
+        </w:pBdr>
+        <w:shd w:fill="EEF1F8" w:color="auto" w:val="clear"/>
+        <w:bidi/>
+        <w:spacing w:after="0" w:before="0" w:line="300"/>
+      </w:pPr>
+      <w:r>
+        <w:rPr>
+          <w:rFonts w:ascii="Arial" w:cs="Arial" w:eastAsia="Arial" w:hAnsi="Arial"/>
+          <w:b/>
+          <w:bCs/>
+          <w:i w:val="false"/>
+          <w:color w:val="1D3A6B"/>
+          <w:sz w:val="22"/>
+          <w:szCs w:val="22"/>
+          <w:rtl/>
+        </w:rPr>
+        <w:t xml:space="preserve">إجابات متوقعة:  </w:t>
+      </w:r>
+      <w:r>
+        <w:rPr>
+          <w:rFonts w:ascii="Arial" w:cs="Arial" w:eastAsia="Arial" w:hAnsi="Arial"/>
+          <w:b w:val="false"/>
+          <w:i w:val="false"/>
+          <w:sz w:val="23"/>
+          <w:szCs w:val="23"/>
+          <w:rtl/>
+        </w:rPr>
+        <w:t xml:space="preserve">سياسات القسم</w:t>
+      </w:r>
+    </w:p>
+    <w:p>
+      <w:pPr>
+        <w:keepNext/>
+        <w:keepLines/>
+        <w:pBdr>
+          <w:right w:val="single" w:color="1D3A6B" w:sz="18" w:space="8"/>
+        </w:pBdr>
+        <w:shd w:fill="EEF1F8" w:color="auto" w:val="clear"/>
+        <w:bidi/>
+        <w:spacing w:after="0" w:before="0" w:line="300"/>
+      </w:pPr>
+      <w:r>
+        <w:rPr>
+          <w:rFonts w:ascii="Arial" w:cs="Arial" w:eastAsia="Arial" w:hAnsi="Arial"/>
+          <w:b w:val="false"/>
+          <w:i w:val="false"/>
+          <w:sz w:val="23"/>
+          <w:szCs w:val="23"/>
+          <w:rtl/>
+        </w:rPr>
+        <w:t xml:space="preserve">مشروع العميل الفلاني</w:t>
+      </w:r>
+    </w:p>
+    <w:p>
+      <w:pPr>
+        <w:keepNext w:val="false"/>
+        <w:keepLines/>
+        <w:pBdr>
+          <w:right w:val="single" w:color="1D3A6B" w:sz="18" w:space="8"/>
+        </w:pBdr>
+        <w:shd w:fill="EEF1F8" w:color="auto" w:val="clear"/>
+        <w:bidi/>
+        <w:spacing w:after="140" w:before="0" w:line="300"/>
+      </w:pPr>
+      <w:r>
+        <w:rPr>
+          <w:rFonts w:ascii="Arial" w:cs="Arial" w:eastAsia="Arial" w:hAnsi="Arial"/>
+          <w:b w:val="false"/>
+          <w:i w:val="false"/>
+          <w:sz w:val="23"/>
+          <w:szCs w:val="23"/>
+          <w:rtl/>
+        </w:rPr>
+        <w:t xml:space="preserve">تدريب الموظفين الجداد</w:t>
+      </w:r>
+    </w:p>
+    <w:p>
+      <w:pPr>
+        <w:keepNext w:val="false"/>
+        <w:keepLines/>
+        <w:pBdr>
+          <w:right w:val="single" w:color="0E4F4B" w:sz="18" w:space="8"/>
+        </w:pBdr>
+        <w:shd w:fill="FFFFFF" w:color="auto" w:val="clear"/>
+        <w:bidi/>
+        <w:spacing w:after="140" w:before="0" w:line="300"/>
+      </w:pPr>
+      <w:r>
+        <w:rPr>
+          <w:rFonts w:ascii="Arial" w:cs="Arial" w:eastAsia="Arial" w:hAnsi="Arial"/>
+          <w:b/>
+          <w:bCs/>
+          <w:i w:val="false"/>
+          <w:color w:val="0E4F4B"/>
+          <w:sz w:val="22"/>
+          <w:szCs w:val="22"/>
+          <w:rtl/>
+        </w:rPr>
+        <w:t xml:space="preserve">وبعدها تقول:  </w:t>
+      </w:r>
+      <w:r>
+        <w:rPr>
+          <w:rFonts w:ascii="Arial" w:cs="Arial" w:eastAsia="Arial" w:hAnsi="Arial"/>
+          <w:b w:val="false"/>
+          <w:i w:val="false"/>
+          <w:sz w:val="23"/>
+          <w:szCs w:val="23"/>
+          <w:rtl/>
+        </w:rPr>
+        <w:t xml:space="preserve">ممتاز. كل اسم فيهم هدف. ده بالظبط الصح.</w:t>
+      </w:r>
+    </w:p>
+    <w:p>
+      <w:pPr>
         <w:pStyle w:val="Heading2"/>
         <w:keepNext/>
         <w:bidi/>
@@ -8024,6 +9215,78 @@
     </w:p>
     <w:p>
       <w:pPr>
+        <w:keepNext w:val="false"/>
+        <w:keepLines/>
+        <w:pBdr>
+          <w:right w:val="single" w:color="555555" w:sz="18" w:space="8"/>
+        </w:pBdr>
+        <w:shd w:fill="EEF2F1" w:color="auto" w:val="clear"/>
+        <w:bidi/>
+        <w:spacing w:after="140" w:before="0" w:line="300"/>
+      </w:pPr>
+      <w:r>
+        <w:rPr>
+          <w:rFonts w:ascii="Arial" w:cs="Arial" w:eastAsia="Arial" w:hAnsi="Arial"/>
+          <w:b/>
+          <w:bCs/>
+          <w:i w:val="false"/>
+          <w:color w:val="555555"/>
+          <w:sz w:val="22"/>
+          <w:szCs w:val="22"/>
+          <w:rtl/>
+        </w:rPr>
+        <w:t xml:space="preserve">على الشاشة / اعمل:  </w:t>
+      </w:r>
+      <w:r>
+        <w:rPr>
+          <w:rFonts w:ascii="Arial" w:cs="Arial" w:eastAsia="Arial" w:hAnsi="Arial"/>
+          <w:b w:val="false"/>
+          <w:i w:val="false"/>
+          <w:sz w:val="23"/>
+          <w:szCs w:val="23"/>
+          <w:rtl/>
+        </w:rPr>
+        <w:t xml:space="preserve">اعرض القاعدة ٤ عمليًا: في دفتر شركة الريادة، اقفل كل المصادر ما عدا «سياسة السفر»، واسأل عن بدل السفر. هيقول ٥٠٠ بس، ومش هيذكر التناقض.</w:t>
+      </w:r>
+    </w:p>
+    <w:p>
+      <w:pPr>
+        <w:keepNext w:val="false"/>
+        <w:keepLines/>
+        <w:pBdr>
+          <w:right w:val="single" w:color="0E4F4B" w:sz="18" w:space="8"/>
+        </w:pBdr>
+        <w:shd w:fill="FFFFFF" w:color="auto" w:val="clear"/>
+        <w:bidi/>
+        <w:spacing w:after="140" w:before="0" w:line="300"/>
+      </w:pPr>
+      <w:r>
+        <w:rPr>
+          <w:rFonts w:ascii="Arial" w:cs="Arial" w:eastAsia="Arial" w:hAnsi="Arial"/>
+          <w:b/>
+          <w:bCs/>
+          <w:i w:val="false"/>
+          <w:color w:val="0E4F4B"/>
+          <w:sz w:val="22"/>
+          <w:szCs w:val="22"/>
+          <w:rtl/>
+        </w:rPr>
+        <w:t xml:space="preserve">تقول:  </w:t>
+      </w:r>
+      <w:r>
+        <w:rPr>
+          <w:rFonts w:ascii="Arial" w:cs="Arial" w:eastAsia="Arial" w:hAnsi="Arial"/>
+          <w:b w:val="false"/>
+          <w:i w:val="false"/>
+          <w:sz w:val="23"/>
+          <w:szCs w:val="23"/>
+          <w:rtl/>
+        </w:rPr>
+        <w:t xml:space="preserve">شايفين؟ لما قفلت المصادر، الإجابة بقت مركّزة، بس خسرت إني أشوف التناقض. يعني القاعدة ٤ سلاح بحدين: فعّل المصادر اللي تخص السؤال، بس لما تكون عايز تكتشف مشاكل، فعّل الكل.</w:t>
+      </w:r>
+    </w:p>
+    <w:p>
+      <w:pPr>
         <w:pStyle w:val="Heading2"/>
         <w:keepNext/>
         <w:bidi/>
@@ -8386,6 +9649,78 @@
           <w:szCs w:val="23"/>
           <w:rtl/>
         </w:rPr>
+        <w:t xml:space="preserve">وقبل التالت، جرّب التاني قدامهم على موضوع «المرتجعات»: «بناءً على الأدلة فقط: ماذا ينبغي أن أفعل بعد ذلك بخصوص مرتجعات العملاء المتأخرة؟».</w:t>
+      </w:r>
+    </w:p>
+    <w:p>
+      <w:pPr>
+        <w:keepNext w:val="false"/>
+        <w:keepLines/>
+        <w:pBdr>
+          <w:right w:val="single" w:color="0E4F4B" w:sz="18" w:space="8"/>
+        </w:pBdr>
+        <w:shd w:fill="FFFFFF" w:color="auto" w:val="clear"/>
+        <w:bidi/>
+        <w:spacing w:after="140" w:before="0" w:line="300"/>
+      </w:pPr>
+      <w:r>
+        <w:rPr>
+          <w:rFonts w:ascii="Arial" w:cs="Arial" w:eastAsia="Arial" w:hAnsi="Arial"/>
+          <w:b/>
+          <w:bCs/>
+          <w:i w:val="false"/>
+          <w:color w:val="0E4F4B"/>
+          <w:sz w:val="22"/>
+          <w:szCs w:val="22"/>
+          <w:rtl/>
+        </w:rPr>
+        <w:t xml:space="preserve">تقول:  </w:t>
+      </w:r>
+      <w:r>
+        <w:rPr>
+          <w:rFonts w:ascii="Arial" w:cs="Arial" w:eastAsia="Arial" w:hAnsi="Arial"/>
+          <w:b w:val="false"/>
+          <w:i w:val="false"/>
+          <w:sz w:val="23"/>
+          <w:szCs w:val="23"/>
+          <w:rtl/>
+        </w:rPr>
+        <w:t xml:space="preserve">لاحظوا إنه رتّب التوصيات حسب قوة الدليل. التوصية اللي عليها سطر صريح في السياسة فوق، والتوصية اللي هو استنتجها تحت. ده بيفرق جدًا لما تروح للمدير: «دي مكتوبة في السياسة» غير «دي أنا شايفها».</w:t>
+      </w:r>
+    </w:p>
+    <w:p>
+      <w:pPr>
+        <w:keepNext w:val="false"/>
+        <w:keepLines/>
+        <w:pBdr>
+          <w:right w:val="single" w:color="555555" w:sz="18" w:space="8"/>
+        </w:pBdr>
+        <w:shd w:fill="EEF2F1" w:color="auto" w:val="clear"/>
+        <w:bidi/>
+        <w:spacing w:after="140" w:before="0" w:line="300"/>
+      </w:pPr>
+      <w:r>
+        <w:rPr>
+          <w:rFonts w:ascii="Arial" w:cs="Arial" w:eastAsia="Arial" w:hAnsi="Arial"/>
+          <w:b/>
+          <w:bCs/>
+          <w:i w:val="false"/>
+          <w:color w:val="555555"/>
+          <w:sz w:val="22"/>
+          <w:szCs w:val="22"/>
+          <w:rtl/>
+        </w:rPr>
+        <w:t xml:space="preserve">على الشاشة / اعمل:  </w:t>
+      </w:r>
+      <w:r>
+        <w:rPr>
+          <w:rFonts w:ascii="Arial" w:cs="Arial" w:eastAsia="Arial" w:hAnsi="Arial"/>
+          <w:b w:val="false"/>
+          <w:i w:val="false"/>
+          <w:sz w:val="23"/>
+          <w:szCs w:val="23"/>
+          <w:rtl/>
+        </w:rPr>
         <w:t xml:space="preserve">جرّب التالت على دفتر شركة الريادة قدامهم. اعرض النتيجة.</w:t>
       </w:r>
     </w:p>
@@ -8532,6 +9867,44 @@
           <w:rtl/>
         </w:rPr>
         <w:t xml:space="preserve">ممكن يرد إنه مش لاقي ده في المصادر. ودي ميزة مش عيب. معناها إنه مش بيألّف.</w:t>
+      </w:r>
+    </w:p>
+    <w:p>
+      <w:pPr>
+        <w:keepNext w:val="false"/>
+        <w:keepLines/>
+        <w:pBdr>
+          <w:right w:val="single" w:color="555555" w:sz="18" w:space="8"/>
+        </w:pBdr>
+        <w:shd w:fill="F5F5F5" w:color="auto" w:val="clear"/>
+        <w:bidi/>
+        <w:spacing w:after="140" w:before="0" w:line="300"/>
+      </w:pPr>
+      <w:r>
+        <w:rPr>
+          <w:rFonts w:ascii="Arial" w:cs="Arial" w:eastAsia="Arial" w:hAnsi="Arial"/>
+          <w:b/>
+          <w:bCs/>
+          <w:i w:val="false"/>
+          <w:color w:val="555555"/>
+          <w:sz w:val="22"/>
+          <w:szCs w:val="22"/>
+          <w:rtl/>
+        </w:rPr>
+        <w:t xml:space="preserve">ملحوظة ليك:  </w:t>
+      </w:r>
+      <w:r>
+        <w:rPr>
+          <w:rFonts w:ascii="Arial" w:cs="Arial" w:eastAsia="Arial" w:hAnsi="Arial"/>
+          <w:b w:val="false"/>
+          <w:i/>
+          <w:iCs/>
+          <w:color w:val="555555"/>
+          <w:sz w:val="23"/>
+          <w:szCs w:val="23"/>
+          <w:rtl/>
+        </w:rPr>
+        <w:t xml:space="preserve">لو عندك وقت إضافي: اعرض «الخريطة الذهنية» بسرعة. دوس على فرع منها، وهتلاقي الدفتر بيسأل نفسه سؤال عن الفرع ده ويجاوب. ده بيبهرهم جدًا.</w:t>
       </w:r>
     </w:p>
     <w:p>
@@ -8632,6 +10005,114 @@
           <w:rtl/>
         </w:rPr>
         <w:t xml:space="preserve">دلوقتي كل واحد هيبني دفتر قسمه. ٣٥ دقيقة. المهام على الشاشة، واعملوها بالترتيب.</w:t>
+      </w:r>
+    </w:p>
+    <w:p>
+      <w:pPr>
+        <w:keepNext w:val="false"/>
+        <w:keepLines/>
+        <w:pBdr>
+          <w:right w:val="single" w:color="0E4F4B" w:sz="18" w:space="8"/>
+        </w:pBdr>
+        <w:shd w:fill="FFFFFF" w:color="auto" w:val="clear"/>
+        <w:bidi/>
+        <w:spacing w:after="140" w:before="0" w:line="300"/>
+      </w:pPr>
+      <w:r>
+        <w:rPr>
+          <w:rFonts w:ascii="Arial" w:cs="Arial" w:eastAsia="Arial" w:hAnsi="Arial"/>
+          <w:b/>
+          <w:bCs/>
+          <w:i w:val="false"/>
+          <w:color w:val="0E4F4B"/>
+          <w:sz w:val="22"/>
+          <w:szCs w:val="22"/>
+          <w:rtl/>
+        </w:rPr>
+        <w:t xml:space="preserve">تقول:  </w:t>
+      </w:r>
+      <w:r>
+        <w:rPr>
+          <w:rFonts w:ascii="Arial" w:cs="Arial" w:eastAsia="Arial" w:hAnsi="Arial"/>
+          <w:b w:val="false"/>
+          <w:i w:val="false"/>
+          <w:sz w:val="23"/>
+          <w:szCs w:val="23"/>
+          <w:rtl/>
+        </w:rPr>
+        <w:t xml:space="preserve">قبل ما تبدأوا: اللي معاه ملفات قسمه يشتغل عليها. واللي مامعاهوش، الملفات الخمسة بتوع شركة الريادة موجودة في فولدر الجلسة. ومحدش يرفع ملف قبل ما يعمل له إشارة المرور.</w:t>
+      </w:r>
+    </w:p>
+    <w:p>
+      <w:pPr>
+        <w:keepNext w:val="false"/>
+        <w:keepLines/>
+        <w:pBdr>
+          <w:right w:val="single" w:color="0E4F4B" w:sz="18" w:space="8"/>
+        </w:pBdr>
+        <w:shd w:fill="FFFFFF" w:color="auto" w:val="clear"/>
+        <w:bidi/>
+        <w:spacing w:after="140" w:before="0" w:line="300"/>
+      </w:pPr>
+      <w:r>
+        <w:rPr>
+          <w:rFonts w:ascii="Arial" w:cs="Arial" w:eastAsia="Arial" w:hAnsi="Arial"/>
+          <w:b/>
+          <w:bCs/>
+          <w:i w:val="false"/>
+          <w:color w:val="0E4F4B"/>
+          <w:sz w:val="22"/>
+          <w:szCs w:val="22"/>
+          <w:rtl/>
+        </w:rPr>
+        <w:t xml:space="preserve">تقول:  </w:t>
+      </w:r>
+      <w:r>
+        <w:rPr>
+          <w:rFonts w:ascii="Arial" w:cs="Arial" w:eastAsia="Arial" w:hAnsi="Arial"/>
+          <w:b w:val="false"/>
+          <w:i w:val="false"/>
+          <w:sz w:val="23"/>
+          <w:szCs w:val="23"/>
+          <w:rtl/>
+        </w:rPr>
+        <w:t xml:space="preserve">وأنا هلف عليكم. لو وقفتوا، ارفعوا إيدكم أو اسألوا جاركم الأول. أحيانًا جاركم أسرع مني.</w:t>
+      </w:r>
+    </w:p>
+    <w:p>
+      <w:pPr>
+        <w:keepNext w:val="false"/>
+        <w:keepLines/>
+        <w:pBdr>
+          <w:right w:val="single" w:color="9A5B12" w:sz="18" w:space="8"/>
+        </w:pBdr>
+        <w:shd w:fill="FBF3E4" w:color="auto" w:val="clear"/>
+        <w:bidi/>
+        <w:spacing w:after="140" w:before="0" w:line="300"/>
+      </w:pPr>
+      <w:r>
+        <w:rPr>
+          <w:rFonts w:ascii="Arial" w:cs="Arial" w:eastAsia="Arial" w:hAnsi="Arial"/>
+          <w:b/>
+          <w:bCs/>
+          <w:i w:val="false"/>
+          <w:color w:val="9A5B12"/>
+          <w:sz w:val="22"/>
+          <w:szCs w:val="22"/>
+          <w:rtl/>
+        </w:rPr>
+        <w:t xml:space="preserve">حيلة ذكية (الزميل قبل المدرب):  </w:t>
+      </w:r>
+      <w:r>
+        <w:rPr>
+          <w:rFonts w:ascii="Arial" w:cs="Arial" w:eastAsia="Arial" w:hAnsi="Arial"/>
+          <w:b w:val="false"/>
+          <w:i w:val="false"/>
+          <w:sz w:val="23"/>
+          <w:szCs w:val="23"/>
+          <w:rtl/>
+        </w:rPr>
+        <w:t xml:space="preserve">تشجيع المتدربين يسألوا بعض الأول بيخفف الضغط عليك، وبيعمل تعاون في القاعة، واللي بيشرح لزميله بيثبّت المعلومة عنده هو كمان.</w:t>
       </w:r>
     </w:p>
     <w:tbl>
@@ -9558,6 +11039,150 @@
     </w:p>
     <w:p>
       <w:pPr>
+        <w:keepNext w:val="false"/>
+        <w:keepLines/>
+        <w:pBdr>
+          <w:right w:val="single" w:color="9B2C2C" w:sz="18" w:space="8"/>
+        </w:pBdr>
+        <w:shd w:fill="FBEAEA" w:color="auto" w:val="clear"/>
+        <w:bidi/>
+        <w:spacing w:after="140" w:before="0" w:line="300"/>
+      </w:pPr>
+      <w:r>
+        <w:rPr>
+          <w:rFonts w:ascii="Arial" w:cs="Arial" w:eastAsia="Arial" w:hAnsi="Arial"/>
+          <w:b/>
+          <w:bCs/>
+          <w:i w:val="false"/>
+          <w:color w:val="9B2C2C"/>
+          <w:sz w:val="22"/>
+          <w:szCs w:val="22"/>
+          <w:rtl/>
+        </w:rPr>
+        <w:t xml:space="preserve">لو حصل:  </w:t>
+      </w:r>
+      <w:r>
+        <w:rPr>
+          <w:rFonts w:ascii="Arial" w:cs="Arial" w:eastAsia="Arial" w:hAnsi="Arial"/>
+          <w:b w:val="false"/>
+          <w:i w:val="false"/>
+          <w:sz w:val="23"/>
+          <w:szCs w:val="23"/>
+          <w:rtl/>
+        </w:rPr>
+        <w:t xml:space="preserve">حساب جوجل بتاع الشغل مقفول عليه NotebookLM: خلّيه يستخدم حساب شخصي مع ملفات التدريب بس، مش ملفات الشركة. ووضّح ده بصراحة.</w:t>
+      </w:r>
+    </w:p>
+    <w:p>
+      <w:pPr>
+        <w:keepNext w:val="false"/>
+        <w:keepLines/>
+        <w:pBdr>
+          <w:right w:val="single" w:color="9B2C2C" w:sz="18" w:space="8"/>
+        </w:pBdr>
+        <w:shd w:fill="FBEAEA" w:color="auto" w:val="clear"/>
+        <w:bidi/>
+        <w:spacing w:after="140" w:before="0" w:line="300"/>
+      </w:pPr>
+      <w:r>
+        <w:rPr>
+          <w:rFonts w:ascii="Arial" w:cs="Arial" w:eastAsia="Arial" w:hAnsi="Arial"/>
+          <w:b/>
+          <w:bCs/>
+          <w:i w:val="false"/>
+          <w:color w:val="9B2C2C"/>
+          <w:sz w:val="22"/>
+          <w:szCs w:val="22"/>
+          <w:rtl/>
+        </w:rPr>
+        <w:t xml:space="preserve">لو حصل:  </w:t>
+      </w:r>
+      <w:r>
+        <w:rPr>
+          <w:rFonts w:ascii="Arial" w:cs="Arial" w:eastAsia="Arial" w:hAnsi="Arial"/>
+          <w:b w:val="false"/>
+          <w:i w:val="false"/>
+          <w:sz w:val="23"/>
+          <w:szCs w:val="23"/>
+          <w:rtl/>
+        </w:rPr>
+        <w:t xml:space="preserve">المخرجات بتطلع بالإنجليزي: من الإعدادات غيّر لغة المخرجات للعربي، أو اكتب في السؤال «أجب بالعربية».</w:t>
+      </w:r>
+    </w:p>
+    <w:p>
+      <w:pPr>
+        <w:keepNext w:val="false"/>
+        <w:keepLines/>
+        <w:pBdr>
+          <w:right w:val="single" w:color="555555" w:sz="18" w:space="8"/>
+        </w:pBdr>
+        <w:shd w:fill="EEF2F1" w:color="auto" w:val="clear"/>
+        <w:bidi/>
+        <w:spacing w:after="140" w:before="0" w:line="300"/>
+      </w:pPr>
+      <w:r>
+        <w:rPr>
+          <w:rFonts w:ascii="Arial" w:cs="Arial" w:eastAsia="Arial" w:hAnsi="Arial"/>
+          <w:b/>
+          <w:bCs/>
+          <w:i w:val="false"/>
+          <w:color w:val="555555"/>
+          <w:sz w:val="22"/>
+          <w:szCs w:val="22"/>
+          <w:rtl/>
+        </w:rPr>
+        <w:t xml:space="preserve">على الشاشة / اعمل:  </w:t>
+      </w:r>
+      <w:r>
+        <w:rPr>
+          <w:rFonts w:ascii="Arial" w:cs="Arial" w:eastAsia="Arial" w:hAnsi="Arial"/>
+          <w:b w:val="false"/>
+          <w:i w:val="false"/>
+          <w:sz w:val="23"/>
+          <w:szCs w:val="23"/>
+          <w:rtl/>
+        </w:rPr>
+        <w:t xml:space="preserve">بعد ١٥ دقيقة بالظبط، اضرب الجرس وقول: «نص الوقت عدّى. المفروض كلكم خلّصتوا الخريطة الذهنية. اللي لسه، ارفع إيدك». روح للي رفعوا الأول.</w:t>
+      </w:r>
+    </w:p>
+    <w:p>
+      <w:pPr>
+        <w:keepNext w:val="false"/>
+        <w:keepLines/>
+        <w:pBdr>
+          <w:right w:val="single" w:color="9A5B12" w:sz="18" w:space="8"/>
+        </w:pBdr>
+        <w:shd w:fill="FBF3E4" w:color="auto" w:val="clear"/>
+        <w:bidi/>
+        <w:spacing w:after="140" w:before="0" w:line="300"/>
+      </w:pPr>
+      <w:r>
+        <w:rPr>
+          <w:rFonts w:ascii="Arial" w:cs="Arial" w:eastAsia="Arial" w:hAnsi="Arial"/>
+          <w:b/>
+          <w:bCs/>
+          <w:i w:val="false"/>
+          <w:color w:val="9A5B12"/>
+          <w:sz w:val="22"/>
+          <w:szCs w:val="22"/>
+          <w:rtl/>
+        </w:rPr>
+        <w:t xml:space="preserve">حيلة ذكية (نقطة التفتيش):  </w:t>
+      </w:r>
+      <w:r>
+        <w:rPr>
+          <w:rFonts w:ascii="Arial" w:cs="Arial" w:eastAsia="Arial" w:hAnsi="Arial"/>
+          <w:b w:val="false"/>
+          <w:i w:val="false"/>
+          <w:sz w:val="23"/>
+          <w:szCs w:val="23"/>
+          <w:rtl/>
+        </w:rPr>
+        <w:t xml:space="preserve">إعلان نص الوقت بيفكّر اللي سرحان، وبيوريك مين محتاج مساعدة قبل ما يفوته الوقت كله.</w:t>
+      </w:r>
+    </w:p>
+    <w:p>
+      <w:pPr>
         <w:pStyle w:val="Heading2"/>
         <w:keepNext/>
         <w:bidi/>
@@ -9929,6 +11554,42 @@
           <w:rtl/>
         </w:rPr>
         <w:t xml:space="preserve">تذكرة الخروج: ورقة خضرا، سؤال واحد هتسأله لدفترك الأسبوع ده عشان تاخد بيه قرار حقيقي.</w:t>
+      </w:r>
+    </w:p>
+    <w:p>
+      <w:pPr>
+        <w:keepNext w:val="false"/>
+        <w:keepLines/>
+        <w:pBdr>
+          <w:right w:val="single" w:color="0E4F4B" w:sz="18" w:space="8"/>
+        </w:pBdr>
+        <w:shd w:fill="FFFFFF" w:color="auto" w:val="clear"/>
+        <w:bidi/>
+        <w:spacing w:after="140" w:before="0" w:line="300"/>
+      </w:pPr>
+      <w:r>
+        <w:rPr>
+          <w:rFonts w:ascii="Arial" w:cs="Arial" w:eastAsia="Arial" w:hAnsi="Arial"/>
+          <w:b/>
+          <w:bCs/>
+          <w:i w:val="false"/>
+          <w:color w:val="0E4F4B"/>
+          <w:sz w:val="22"/>
+          <w:szCs w:val="22"/>
+          <w:rtl/>
+        </w:rPr>
+        <w:t xml:space="preserve">تقول:  </w:t>
+      </w:r>
+      <w:r>
+        <w:rPr>
+          <w:rFonts w:ascii="Arial" w:cs="Arial" w:eastAsia="Arial" w:hAnsi="Arial"/>
+          <w:b w:val="false"/>
+          <w:i w:val="false"/>
+          <w:sz w:val="23"/>
+          <w:szCs w:val="23"/>
+          <w:rtl/>
+        </w:rPr>
+        <w:t xml:space="preserve">قبل التشويقة، خلّوني ألخص النهارده في ٣ جمل: الدفتر بيجاوب من مصادرك إنت ومعاه الدليل. إشارة المرور قبل أي رفع. واسأل أسئلة أقوى من «لخّص».</w:t>
       </w:r>
     </w:p>
     <w:p>

</xml_diff>